<commit_message>
Clarify AI use disclosure in final report
</commit_message>
<xml_diff>
--- a/Report/COM6523 Software Reengineering Group Project Report.docx
+++ b/Report/COM6523 Software Reengineering Group Project Report.docx
@@ -4811,7 +4811,7 @@
           <w:b w:val="0"/>
           <w:i w:val="0"/>
         </w:rPr>
-        <w:t>Generative AI tools, including ChatGPT and Codex, were used during this project as supporting tools. They were not used as a replacement for group understanding, testing, or evaluation. All generated suggestions were reviewed, tested, and adapted by the group before being included in the repository or report.</w:t>
+        <w:t>Generative AI tools, including ChatGPT and Codex, were used during this project as supporting tools. The project ideas, reengineering direction, target selection, technical judgements, and acceptance decisions came from the group members. AI tools were not used as a replacement for group understanding, testing, or evaluation. Any AI-generated suggestions, wording, or code-editing assistance were reviewed, checked against the repository evidence, and adapted by the group before being included in the report or repository.</w:t>
       </w:r>
     </w:p>
     <w:p>
@@ -4838,7 +4838,7 @@
           <w:b w:val="0"/>
           <w:i w:val="0"/>
         </w:rPr>
-        <w:t>ChatGPT was used to support planning, structuring, and explanation during the project. It helped interpret the coursework brief, plan the local setup process, suggest baseline analysis techniques, organise the report structure, summarise testing and metric evidence, and draft or revise explanatory report sections.</w:t>
+        <w:t>ChatGPT was used mainly to support communication, planning, and report writing. It helped the group discuss possible workflows, interpret the coursework brief, organise the report structure, summarise testing and metric results, and turn group decisions into clearer English prose. Some group members also used AI-assisted translation to convert their own Chinese notes, explanations, and draft contributions into English because they were less confident writing technical academic English directly.</w:t>
       </w:r>
     </w:p>
     <w:p>
@@ -4851,7 +4851,7 @@
           <w:b w:val="0"/>
           <w:i w:val="0"/>
         </w:rPr>
-        <w:t>Codex was used to assist with repository-based tasks. It helped add focused regression tests, refactor URL.join() helper logic, move join-specific helpers into yarl/_join.py, move child path assembly from URL._make_child() into yarl/_path.py, improve reproducibility of analysis scripts, add dynamic analysis evidence, update local verification tooling, inspect GitHub Actions limitations, and update this final report. The group remained responsible for checking that the work matched the coursework requirements and repository evidence.</w:t>
+        <w:t>Codex was used as a coding and repository assistant after the group had identified the reengineering direction and intended evidence chain. It helped apply small, reviewable code edits, prepare regression-test and analysis-support files, organise evidence under Submission/, inspect GitHub status, and update report wording to match the completed repository work. The group remained responsible for deciding which changes were appropriate, checking that public behaviour was preserved, running or reviewing the verification evidence, and deciding what to accept.</w:t>
       </w:r>
     </w:p>
     <w:p>
@@ -4878,7 +4878,7 @@
           <w:b w:val="0"/>
           <w:i w:val="0"/>
         </w:rPr>
-        <w:t>All code generated or edited with AI assistance was manually reviewed and verified through focused regression tests, existing join-related tests, the full local test suite, and Radon complexity and maintainability checks. The repository evidence supporting this work includes the tests, yarl source changes, local check script, analysis outputs, final verification outputs, commits, pull requests, and issues listed in the following appendices.</w:t>
+        <w:t>The evidence for the submitted work is in the repository rather than in the AI conversation. This includes the focused regression tests, yarl source changes, analysis scripts and outputs, local quality-check script, final pytest and Radon results, GitHub issues, pull requests, and commits listed in the following appendices. All accepted code changes were checked through focused regression tests, existing join-related tests, the full local test suite, and Radon complexity and maintainability checks.</w:t>
       </w:r>
     </w:p>
     <w:p>

</xml_diff>

<commit_message>
Update report members and AI disclosure
</commit_message>
<xml_diff>
--- a/Report/COM6523 Software Reengineering Group Project Report.docx
+++ b/Report/COM6523 Software Reengineering Group Project Report.docx
@@ -515,57 +515,21 @@
       <w:tr>
         <w:tc>
           <w:tcPr>
-            <w:tcW w:type="dxa" w:w="2448"/>
-            <w:vAlign w:val="top"/>
-            <w:tcBorders>
-              <w:top w:val="single" w:sz="4" w:space="0" w:color="B7B7B7"/>
-              <w:left w:val="single" w:sz="4" w:space="0" w:color="B7B7B7"/>
-              <w:bottom w:val="single" w:sz="4" w:space="0" w:color="B7B7B7"/>
-              <w:right w:val="single" w:sz="4" w:space="0" w:color="B7B7B7"/>
-              <w:insideH w:val="single" w:sz="4" w:space="0" w:color="B7B7B7"/>
-              <w:insideV w:val="single" w:sz="4" w:space="0" w:color="B7B7B7"/>
-            </w:tcBorders>
-          </w:tcPr>
-          <w:p>
-            <w:pPr>
-              <w:spacing w:after="40"/>
-            </w:pPr>
-            <w:r>
-              <w:rPr>
-                <w:rFonts w:ascii="Arial" w:hAnsi="Arial" w:eastAsia="Arial"/>
-                <w:b w:val="0"/>
-                <w:i w:val="0"/>
-                <w:sz w:val="17"/>
-              </w:rPr>
+            <w:tcW w:type="dxa" w:w="4729"/>
+          </w:tcPr>
+          <w:p>
+            <w:r>
               <w:t>Dibing Bai</w:t>
             </w:r>
           </w:p>
         </w:tc>
         <w:tc>
           <w:tcPr>
-            <w:tcW w:type="dxa" w:w="7632"/>
-            <w:vAlign w:val="top"/>
-            <w:tcBorders>
-              <w:top w:val="single" w:sz="4" w:space="0" w:color="B7B7B7"/>
-              <w:left w:val="single" w:sz="4" w:space="0" w:color="B7B7B7"/>
-              <w:bottom w:val="single" w:sz="4" w:space="0" w:color="B7B7B7"/>
-              <w:right w:val="single" w:sz="4" w:space="0" w:color="B7B7B7"/>
-              <w:insideH w:val="single" w:sz="4" w:space="0" w:color="B7B7B7"/>
-              <w:insideV w:val="single" w:sz="4" w:space="0" w:color="B7B7B7"/>
-            </w:tcBorders>
-          </w:tcPr>
-          <w:p>
-            <w:pPr>
-              <w:spacing w:after="40"/>
-            </w:pPr>
-            <w:r>
-              <w:rPr>
-                <w:rFonts w:ascii="Arial" w:hAnsi="Arial" w:eastAsia="Arial"/>
-                <w:b w:val="0"/>
-                <w:i w:val="0"/>
-                <w:sz w:val="17"/>
-              </w:rPr>
-              <w:t>Project setup, repository preparation, baseline environment evidence, and local regression testing.</w:t>
+            <w:tcW w:type="dxa" w:w="4729"/>
+          </w:tcPr>
+          <w:p>
+            <w:r>
+              <w:t>Project setup, repository preparation, baseline environment evidence, and focused local regression testing.</w:t>
             </w:r>
           </w:p>
         </w:tc>
@@ -573,57 +537,21 @@
       <w:tr>
         <w:tc>
           <w:tcPr>
-            <w:tcW w:type="dxa" w:w="2448"/>
-            <w:vAlign w:val="top"/>
-            <w:tcBorders>
-              <w:top w:val="single" w:sz="4" w:space="0" w:color="B7B7B7"/>
-              <w:left w:val="single" w:sz="4" w:space="0" w:color="B7B7B7"/>
-              <w:bottom w:val="single" w:sz="4" w:space="0" w:color="B7B7B7"/>
-              <w:right w:val="single" w:sz="4" w:space="0" w:color="B7B7B7"/>
-              <w:insideH w:val="single" w:sz="4" w:space="0" w:color="B7B7B7"/>
-              <w:insideV w:val="single" w:sz="4" w:space="0" w:color="B7B7B7"/>
-            </w:tcBorders>
-          </w:tcPr>
-          <w:p>
-            <w:pPr>
-              <w:spacing w:after="40"/>
-            </w:pPr>
-            <w:r>
-              <w:rPr>
-                <w:rFonts w:ascii="Arial" w:hAnsi="Arial" w:eastAsia="Arial"/>
-                <w:b w:val="0"/>
-                <w:i w:val="0"/>
-                <w:sz w:val="17"/>
-              </w:rPr>
+            <w:tcW w:type="dxa" w:w="4729"/>
+          </w:tcPr>
+          <w:p>
+            <w:r>
               <w:t>Yongjiang Liu</w:t>
             </w:r>
           </w:p>
         </w:tc>
         <w:tc>
           <w:tcPr>
-            <w:tcW w:type="dxa" w:w="7632"/>
-            <w:vAlign w:val="top"/>
-            <w:tcBorders>
-              <w:top w:val="single" w:sz="4" w:space="0" w:color="B7B7B7"/>
-              <w:left w:val="single" w:sz="4" w:space="0" w:color="B7B7B7"/>
-              <w:bottom w:val="single" w:sz="4" w:space="0" w:color="B7B7B7"/>
-              <w:right w:val="single" w:sz="4" w:space="0" w:color="B7B7B7"/>
-              <w:insideH w:val="single" w:sz="4" w:space="0" w:color="B7B7B7"/>
-              <w:insideV w:val="single" w:sz="4" w:space="0" w:color="B7B7B7"/>
-            </w:tcBorders>
-          </w:tcPr>
-          <w:p>
-            <w:pPr>
-              <w:spacing w:after="40"/>
-            </w:pPr>
-            <w:r>
-              <w:rPr>
-                <w:rFonts w:ascii="Arial" w:hAnsi="Arial" w:eastAsia="Arial"/>
-                <w:b w:val="0"/>
-                <w:i w:val="0"/>
-                <w:sz w:val="17"/>
-              </w:rPr>
-              <w:t>System understanding, public API inventory, repository coordination, and final report integration.</w:t>
+            <w:tcW w:type="dxa" w:w="4729"/>
+          </w:tcPr>
+          <w:p>
+            <w:r>
+              <w:t>Project coordination, coursework requirement interpretation, target selection, system understanding, GitHub branch and PR integration, and final report/evidence synthesis.</w:t>
             </w:r>
           </w:p>
         </w:tc>
@@ -631,57 +559,21 @@
       <w:tr>
         <w:tc>
           <w:tcPr>
-            <w:tcW w:type="dxa" w:w="2448"/>
-            <w:vAlign w:val="top"/>
-            <w:tcBorders>
-              <w:top w:val="single" w:sz="4" w:space="0" w:color="B7B7B7"/>
-              <w:left w:val="single" w:sz="4" w:space="0" w:color="B7B7B7"/>
-              <w:bottom w:val="single" w:sz="4" w:space="0" w:color="B7B7B7"/>
-              <w:right w:val="single" w:sz="4" w:space="0" w:color="B7B7B7"/>
-              <w:insideH w:val="single" w:sz="4" w:space="0" w:color="B7B7B7"/>
-              <w:insideV w:val="single" w:sz="4" w:space="0" w:color="B7B7B7"/>
-            </w:tcBorders>
-          </w:tcPr>
-          <w:p>
-            <w:pPr>
-              <w:spacing w:after="40"/>
-            </w:pPr>
-            <w:r>
-              <w:rPr>
-                <w:rFonts w:ascii="Arial" w:hAnsi="Arial" w:eastAsia="Arial"/>
-                <w:b w:val="0"/>
-                <w:i w:val="0"/>
-                <w:sz w:val="17"/>
-              </w:rPr>
-              <w:t>Harry Martel</w:t>
-            </w:r>
-          </w:p>
-        </w:tc>
-        <w:tc>
-          <w:tcPr>
-            <w:tcW w:type="dxa" w:w="7632"/>
-            <w:vAlign w:val="top"/>
-            <w:tcBorders>
-              <w:top w:val="single" w:sz="4" w:space="0" w:color="B7B7B7"/>
-              <w:left w:val="single" w:sz="4" w:space="0" w:color="B7B7B7"/>
-              <w:bottom w:val="single" w:sz="4" w:space="0" w:color="B7B7B7"/>
-              <w:right w:val="single" w:sz="4" w:space="0" w:color="B7B7B7"/>
-              <w:insideH w:val="single" w:sz="4" w:space="0" w:color="B7B7B7"/>
-              <w:insideV w:val="single" w:sz="4" w:space="0" w:color="B7B7B7"/>
-            </w:tcBorders>
-          </w:tcPr>
-          <w:p>
-            <w:pPr>
-              <w:spacing w:after="40"/>
-            </w:pPr>
-            <w:r>
-              <w:rPr>
-                <w:rFonts w:ascii="Arial" w:hAnsi="Arial" w:eastAsia="Arial"/>
-                <w:b w:val="0"/>
-                <w:i w:val="0"/>
-                <w:sz w:val="17"/>
-              </w:rPr>
-              <w:t>Upstream evolution analysis, commit-history mining, LOC-over-time evidence, and chart generation.</w:t>
+            <w:tcW w:type="dxa" w:w="4729"/>
+          </w:tcPr>
+          <w:p>
+            <w:r>
+              <w:t>Jingxuan Wang</w:t>
+            </w:r>
+          </w:p>
+        </w:tc>
+        <w:tc>
+          <w:tcPr>
+            <w:tcW w:type="dxa" w:w="4729"/>
+          </w:tcPr>
+          <w:p>
+            <w:r>
+              <w:t>Static analysis, Radon and code-smell interpretation, restructuring rationale, and requirement-alignment review.</w:t>
             </w:r>
           </w:p>
         </w:tc>
@@ -689,57 +581,21 @@
       <w:tr>
         <w:tc>
           <w:tcPr>
-            <w:tcW w:type="dxa" w:w="2448"/>
-            <w:vAlign w:val="top"/>
-            <w:tcBorders>
-              <w:top w:val="single" w:sz="4" w:space="0" w:color="B7B7B7"/>
-              <w:left w:val="single" w:sz="4" w:space="0" w:color="B7B7B7"/>
-              <w:bottom w:val="single" w:sz="4" w:space="0" w:color="B7B7B7"/>
-              <w:right w:val="single" w:sz="4" w:space="0" w:color="B7B7B7"/>
-              <w:insideH w:val="single" w:sz="4" w:space="0" w:color="B7B7B7"/>
-              <w:insideV w:val="single" w:sz="4" w:space="0" w:color="B7B7B7"/>
-            </w:tcBorders>
-          </w:tcPr>
-          <w:p>
-            <w:pPr>
-              <w:spacing w:after="40"/>
-            </w:pPr>
-            <w:r>
-              <w:rPr>
-                <w:rFonts w:ascii="Arial" w:hAnsi="Arial" w:eastAsia="Arial"/>
-                <w:b w:val="0"/>
-                <w:i w:val="0"/>
-                <w:sz w:val="17"/>
-              </w:rPr>
-              <w:t>Jingxuan Wang</w:t>
-            </w:r>
-          </w:p>
-        </w:tc>
-        <w:tc>
-          <w:tcPr>
-            <w:tcW w:type="dxa" w:w="7632"/>
-            <w:vAlign w:val="top"/>
-            <w:tcBorders>
-              <w:top w:val="single" w:sz="4" w:space="0" w:color="B7B7B7"/>
-              <w:left w:val="single" w:sz="4" w:space="0" w:color="B7B7B7"/>
-              <w:bottom w:val="single" w:sz="4" w:space="0" w:color="B7B7B7"/>
-              <w:right w:val="single" w:sz="4" w:space="0" w:color="B7B7B7"/>
-              <w:insideH w:val="single" w:sz="4" w:space="0" w:color="B7B7B7"/>
-              <w:insideV w:val="single" w:sz="4" w:space="0" w:color="B7B7B7"/>
-            </w:tcBorders>
-          </w:tcPr>
-          <w:p>
-            <w:pPr>
-              <w:spacing w:after="40"/>
-            </w:pPr>
-            <w:r>
-              <w:rPr>
-                <w:rFonts w:ascii="Arial" w:hAnsi="Arial" w:eastAsia="Arial"/>
-                <w:b w:val="0"/>
-                <w:i w:val="0"/>
-                <w:sz w:val="17"/>
-              </w:rPr>
-              <w:t>Static analysis, code smell interpretation, target-selection rationale, and restructuring requirements.</w:t>
+            <w:tcW w:type="dxa" w:w="4729"/>
+          </w:tcPr>
+          <w:p>
+            <w:r>
+              <w:t>Ziqi Zhao</w:t>
+            </w:r>
+          </w:p>
+        </w:tc>
+        <w:tc>
+          <w:tcPr>
+            <w:tcW w:type="dxa" w:w="4729"/>
+          </w:tcPr>
+          <w:p>
+            <w:r>
+              <w:t>Regression test design for URL.join(), URL.joinpath(), and the / operator; URL.join() refactoring evidence; and before/after evaluation.</w:t>
             </w:r>
           </w:p>
         </w:tc>
@@ -747,115 +603,21 @@
       <w:tr>
         <w:tc>
           <w:tcPr>
-            <w:tcW w:type="dxa" w:w="2448"/>
-            <w:vAlign w:val="top"/>
-            <w:tcBorders>
-              <w:top w:val="single" w:sz="4" w:space="0" w:color="B7B7B7"/>
-              <w:left w:val="single" w:sz="4" w:space="0" w:color="B7B7B7"/>
-              <w:bottom w:val="single" w:sz="4" w:space="0" w:color="B7B7B7"/>
-              <w:right w:val="single" w:sz="4" w:space="0" w:color="B7B7B7"/>
-              <w:insideH w:val="single" w:sz="4" w:space="0" w:color="B7B7B7"/>
-              <w:insideV w:val="single" w:sz="4" w:space="0" w:color="B7B7B7"/>
-            </w:tcBorders>
-          </w:tcPr>
-          <w:p>
-            <w:pPr>
-              <w:spacing w:after="40"/>
-            </w:pPr>
-            <w:r>
-              <w:rPr>
-                <w:rFonts w:ascii="Arial" w:hAnsi="Arial" w:eastAsia="Arial"/>
-                <w:b w:val="0"/>
-                <w:i w:val="0"/>
-                <w:sz w:val="17"/>
-              </w:rPr>
-              <w:t>Ziqi Zhao</w:t>
-            </w:r>
-          </w:p>
-        </w:tc>
-        <w:tc>
-          <w:tcPr>
-            <w:tcW w:type="dxa" w:w="7632"/>
-            <w:vAlign w:val="top"/>
-            <w:tcBorders>
-              <w:top w:val="single" w:sz="4" w:space="0" w:color="B7B7B7"/>
-              <w:left w:val="single" w:sz="4" w:space="0" w:color="B7B7B7"/>
-              <w:bottom w:val="single" w:sz="4" w:space="0" w:color="B7B7B7"/>
-              <w:right w:val="single" w:sz="4" w:space="0" w:color="B7B7B7"/>
-              <w:insideH w:val="single" w:sz="4" w:space="0" w:color="B7B7B7"/>
-              <w:insideV w:val="single" w:sz="4" w:space="0" w:color="B7B7B7"/>
-            </w:tcBorders>
-          </w:tcPr>
-          <w:p>
-            <w:pPr>
-              <w:spacing w:after="40"/>
-            </w:pPr>
-            <w:r>
-              <w:rPr>
-                <w:rFonts w:ascii="Arial" w:hAnsi="Arial" w:eastAsia="Arial"/>
-                <w:b w:val="0"/>
-                <w:i w:val="0"/>
-                <w:sz w:val="17"/>
-              </w:rPr>
-              <w:t>Regression test design, URL.join refactoring evidence, and before/after evaluation.</w:t>
-            </w:r>
-          </w:p>
-        </w:tc>
-      </w:tr>
-      <w:tr>
-        <w:tc>
-          <w:tcPr>
-            <w:tcW w:type="dxa" w:w="2448"/>
-            <w:vAlign w:val="top"/>
-            <w:tcBorders>
-              <w:top w:val="single" w:sz="4" w:space="0" w:color="B7B7B7"/>
-              <w:left w:val="single" w:sz="4" w:space="0" w:color="B7B7B7"/>
-              <w:bottom w:val="single" w:sz="4" w:space="0" w:color="B7B7B7"/>
-              <w:right w:val="single" w:sz="4" w:space="0" w:color="B7B7B7"/>
-              <w:insideH w:val="single" w:sz="4" w:space="0" w:color="B7B7B7"/>
-              <w:insideV w:val="single" w:sz="4" w:space="0" w:color="B7B7B7"/>
-            </w:tcBorders>
-          </w:tcPr>
-          <w:p>
-            <w:pPr>
-              <w:spacing w:after="40"/>
-            </w:pPr>
-            <w:r>
-              <w:rPr>
-                <w:rFonts w:ascii="Arial" w:hAnsi="Arial" w:eastAsia="Arial"/>
-                <w:b w:val="0"/>
-                <w:i w:val="0"/>
-                <w:sz w:val="17"/>
-              </w:rPr>
+            <w:tcW w:type="dxa" w:w="4729"/>
+          </w:tcPr>
+          <w:p>
+            <w:r>
               <w:t>Xuhao Zhou</w:t>
             </w:r>
           </w:p>
         </w:tc>
         <w:tc>
           <w:tcPr>
-            <w:tcW w:type="dxa" w:w="7632"/>
-            <w:vAlign w:val="top"/>
-            <w:tcBorders>
-              <w:top w:val="single" w:sz="4" w:space="0" w:color="B7B7B7"/>
-              <w:left w:val="single" w:sz="4" w:space="0" w:color="B7B7B7"/>
-              <w:bottom w:val="single" w:sz="4" w:space="0" w:color="B7B7B7"/>
-              <w:right w:val="single" w:sz="4" w:space="0" w:color="B7B7B7"/>
-              <w:insideH w:val="single" w:sz="4" w:space="0" w:color="B7B7B7"/>
-              <w:insideV w:val="single" w:sz="4" w:space="0" w:color="B7B7B7"/>
-            </w:tcBorders>
-          </w:tcPr>
-          <w:p>
-            <w:pPr>
-              <w:spacing w:after="40"/>
-            </w:pPr>
-            <w:r>
-              <w:rPr>
-                <w:rFonts w:ascii="Arial" w:hAnsi="Arial" w:eastAsia="Arial"/>
-                <w:b w:val="0"/>
-                <w:i w:val="0"/>
-                <w:sz w:val="17"/>
-              </w:rPr>
-              <w:t>Report drafting, GitHub workflow evidence, final verification evidence, and document preparation.</w:t>
+            <w:tcW w:type="dxa" w:w="4729"/>
+          </w:tcPr>
+          <w:p>
+            <w:r>
+              <w:t>Upstream evolution analysis, dynamic analysis evidence, GitHub workflow/local verification evidence, and document preparation.</w:t>
             </w:r>
           </w:p>
         </w:tc>
@@ -4806,12 +4568,7 @@
         <w:spacing w:after="120" w:line="259" w:lineRule="auto"/>
       </w:pPr>
       <w:r>
-        <w:rPr>
-          <w:rFonts w:ascii="Arial" w:hAnsi="Arial" w:eastAsia="Arial"/>
-          <w:b w:val="0"/>
-          <w:i w:val="0"/>
-        </w:rPr>
-        <w:t>Generative AI tools, including ChatGPT and Codex, were used during this project as supporting tools. The project ideas, reengineering direction, target selection, technical judgements, and acceptance decisions came from the group members. AI tools were not used as a replacement for group understanding, testing, or evaluation. Any AI-generated suggestions, wording, or code-editing assistance were reviewed, checked against the repository evidence, and adapted by the group before being included in the report or repository.</w:t>
+        <w:t>Generative AI tools, including ChatGPT and Codex, were used during this project as supporting tools. The project ideas, reengineering direction, target selection, technical judgements, and acceptance decisions came from the group members. AI tools were used to support wording, translation, code-editing assistance, and evidence organisation; they were not used as a replacement for group understanding, testing, or evaluation. Any AI-generated suggestions, wording, translation, or code-editing assistance were reviewed, checked against the repository evidence, and adapted by the group before being included in the report or repository.</w:t>
       </w:r>
     </w:p>
     <w:p>
@@ -4833,12 +4590,7 @@
         <w:spacing w:after="120" w:line="259" w:lineRule="auto"/>
       </w:pPr>
       <w:r>
-        <w:rPr>
-          <w:rFonts w:ascii="Arial" w:hAnsi="Arial" w:eastAsia="Arial"/>
-          <w:b w:val="0"/>
-          <w:i w:val="0"/>
-        </w:rPr>
-        <w:t>ChatGPT was used mainly to support communication, planning, and report writing. It helped the group discuss possible workflows, interpret the coursework brief, organise the report structure, summarise testing and metric results, and turn group decisions into clearer English prose. Some group members also used AI-assisted translation to convert their own Chinese notes, explanations, and draft contributions into English because they were less confident writing technical academic English directly.</w:t>
+        <w:t>ChatGPT was used mainly to support communication, planning, translation, and report writing. It helped the group discuss possible workflows, interpret the coursework brief, organise the report structure, summarise testing and metric results, and turn group decisions into clearer English prose. Some group members drafted notes and explanations in Chinese and used AI-assisted translation or language polishing because they were less confident writing technical academic English directly. The translated or polished wording was then checked against the group's own understanding and the committed repository evidence.</w:t>
       </w:r>
     </w:p>
     <w:p>
@@ -4846,11 +4598,6 @@
         <w:spacing w:after="120" w:line="259" w:lineRule="auto"/>
       </w:pPr>
       <w:r>
-        <w:rPr>
-          <w:rFonts w:ascii="Arial" w:hAnsi="Arial" w:eastAsia="Arial"/>
-          <w:b w:val="0"/>
-          <w:i w:val="0"/>
-        </w:rPr>
         <w:t>Codex was used as a coding and repository assistant after the group had identified the reengineering direction and intended evidence chain. It helped apply small, reviewable code edits, prepare regression-test and analysis-support files, organise evidence under Submission/, inspect GitHub status, and update report wording to match the completed repository work. The group remained responsible for deciding which changes were appropriate, checking that public behaviour was preserved, running or reviewing the verification evidence, and deciding what to accept.</w:t>
       </w:r>
     </w:p>
@@ -4873,12 +4620,7 @@
         <w:spacing w:after="120" w:line="259" w:lineRule="auto"/>
       </w:pPr>
       <w:r>
-        <w:rPr>
-          <w:rFonts w:ascii="Arial" w:hAnsi="Arial" w:eastAsia="Arial"/>
-          <w:b w:val="0"/>
-          <w:i w:val="0"/>
-        </w:rPr>
-        <w:t>The evidence for the submitted work is in the repository rather than in the AI conversation. This includes the focused regression tests, yarl source changes, analysis scripts and outputs, local quality-check script, final pytest and Radon results, GitHub issues, pull requests, and commits listed in the following appendices. All accepted code changes were checked through focused regression tests, existing join-related tests, the full local test suite, and Radon complexity and maintainability checks.</w:t>
+        <w:t>The evidence for the submitted work is in the repository rather than in the AI conversation. This includes the focused regression tests, yarl source changes, analysis scripts and outputs, local quality-check script, final pytest and Radon results, GitHub issues, pull requests, and commits listed in the following appendices. No source evidence, test result, commit record, or project decision is claimed solely on the basis of AI output. All accepted code changes were checked through focused regression tests, existing join-related tests, the full local test suite, and Radon complexity and maintainability checks.</w:t>
       </w:r>
     </w:p>
     <w:p>

</xml_diff>

<commit_message>
Expand final report body and evidence figures
</commit_message>
<xml_diff>
--- a/Report/COM6523 Software Reengineering Group Project Report.docx
+++ b/Report/COM6523 Software Reengineering Group Project Report.docx
@@ -731,6 +731,18 @@
         <w:t>At a high level, yarl is intentionally compact from a user's point of view. Most interactions pass through the URL class: callers construct a URL, inspect its parts, update selected components, join relative references, or append child path segments. Internally, however, this apparently simple interface must handle encoded and decoded forms, absolute and relative URLs, authority components, query strings, fragments, path normalisation, and quoting rules. This creates a natural tension between a convenient public facade and a large amount of internal URL semantics.</w:t>
       </w:r>
     </w:p>
+    <w:p>
+      <w:pPr/>
+      <w:r>
+        <w:t>The original system is a URL manipulation library rather than an end-user application. Its main function is to turn URL strings into structured URL objects, then allow callers to inspect or change components such as scheme, host, path, query, and fragment. It also has to preserve difficult URL details such as percent-encoded characters, host encoding, relative references, and path normalisation. This is why the public API looks simple while the internal implementation has to coordinate several specialised concerns.</w:t>
+      </w:r>
+    </w:p>
+    <w:p>
+      <w:pPr/>
+      <w:r>
+        <w:t>The architecture reflects that tension. Users mostly interact with URL in yarl/_url.py, but the implementation also depends on parsing, quoting, query, path, and cache helpers. This means _url.py is both the stable public facade and the place where many helper responsibilities meet. The report therefore treats _url.py as an architectural coordination point rather than merely as a large file. The reengineering problem was to reduce detailed responsibility inside that coordinator without changing the behaviour users depend on.</w:t>
+      </w:r>
+    </w:p>
     <w:tbl>
       <w:tblPr>
         <w:tblStyle w:val="TableGrid"/>
@@ -1364,6 +1376,18 @@
       </w:r>
     </w:p>
     <w:p>
+      <w:pPr/>
+      <w:r>
+        <w:t>The evolution evidence shows that this architecture has changed over time. The LOC sample in Submission/analysis/loc_over_time.csv records growth from v0.0.1 with 2 files, 380 source lines, and 825 test lines to the analysed HEAD snapshot with 24 files, 2764 source lines, and 6407 test lines. The test suite grew faster than the production code, which suggests that maintainers increasingly protected compatibility as the library matured. This influenced our own approach: any restructuring needed to be test-led rather than speculative.</w:t>
+      </w:r>
+    </w:p>
+    <w:p>
+      <w:pPr/>
+      <w:r>
+        <w:t>The file-count growth also shows architectural decomposition. Early versions were smaller and more concentrated. Later versions split responsibilities into modules such as _parse.py, _path.py, _query.py, and the quoting implementations. Several 2024 upstream commits explicitly moved URL parsing, query-string functions, quoters, and path functions into their own modules. Our restructuring follows this direction by continuing to move path-resolution details away from _url.py and into focused private modules.</w:t>
+      </w:r>
+    </w:p>
+    <w:p>
       <w:pPr>
         <w:pStyle w:val="Heading2"/>
       </w:pPr>
@@ -1388,6 +1412,18 @@
           <w:i w:val="0"/>
         </w:rPr>
         <w:t>The upstream repository contained 1927 commits at the analysed snapshot, which made it suitable for version repository analysis. The group mined commit activity, LOC over time, and refactoring-related commit messages into Submission/analysis. The LOC evidence shows growth from a small utility into a mature library with a larger test suite than source-code base, which supports the strategy of using automated tests as the primary guard against behavioural regression.</w:t>
+      </w:r>
+    </w:p>
+    <w:p>
+      <w:pPr/>
+      <w:r>
+        <w:t>The driving forces behind the system's changes appear to be compatibility, packaging, performance, and maintainability rather than feature expansion alone. The refactoring-commit search found many maintenance commits in 2024, including removal of internal SplitResult usage, cleanup of _url.py constants, movement of parsing/query/path functions into separate modules, and small cleanups around URL.join() and child-path creation. These commits indicate a mature project where internal structure is regularly adjusted to preserve a clean implementation behind a stable API.</w:t>
+      </w:r>
+    </w:p>
+    <w:p>
+      <w:pPr/>
+      <w:r>
+        <w:t>The size and complexity trend also explains why a conservative target was chosen. A library with more than 1900 upstream commits and over 9000 sampled source-plus-test lines is not a safe place for broad redesign in a short coursework project. The evidence instead suggested a smaller intervention: identify a central responsibility that had become complex, add focused tests, move the responsibility to an existing helper area, and then compare the result using the same analysis tools.</w:t>
       </w:r>
     </w:p>
     <w:p>
@@ -1514,6 +1550,18 @@
       </w:r>
     </w:p>
     <w:p>
+      <w:pPr/>
+      <w:r>
+        <w:t>The original developers' reengineering efforts were partly successful because they created the structure that made our narrower restructuring possible. For example, moving path functions into yarl/_path.py made it reasonable for our project to move child path assembly there as well. The later URL.join cleanup commits also showed that maintainers had already considered join logic worth simplifying. However, the base snapshot still left URL.join() and URL._make_child() with C (17) Radon complexity scores, so the earlier work had not removed all path-resolution complexity from _url.py.</w:t>
+      </w:r>
+    </w:p>
+    <w:p>
+      <w:pPr/>
+      <w:r>
+        <w:t>This conclusion matters for target selection. We did not choose URL.join() simply because an upstream commit name mentioned it. We chose it because repository history, module architecture, static complexity, and regression-test feasibility all pointed in the same direction. URL._make_child() was then selected as a related second target because it supports URL.joinpath() and the / operator and because its path assembly responsibility naturally belonged with the path helpers.</w:t>
+      </w:r>
+    </w:p>
+    <w:p>
       <w:pPr>
         <w:pStyle w:val="Heading2"/>
       </w:pPr>
@@ -1538,6 +1586,18 @@
           <w:i w:val="0"/>
         </w:rPr>
         <w:t>Baseline Radon complexity results identified several non-trivial methods in yarl/_url.py. URL.build() had the highest complexity at E (38), but it handles a broad construction interface with many public behaviours, so it was judged too risky for the project timeframe. A more focused and still meaningful opportunity existed in URL.join() and URL._make_child(), both rated C (17). These methods sit behind path-resolution behaviours that can be covered with targeted regression tests.</w:t>
+      </w:r>
+    </w:p>
+    <w:p>
+      <w:pPr/>
+      <w:r>
+        <w:t>The remaining code smells in the base snapshot were therefore responsibility concentration and method complexity. URL.build() had a higher complexity score, but it also had a broader construction role and many optional inputs. Refactoring it would risk changing validation or construction semantics across a larger part of the API. URL.join() and URL._make_child() were better targets because their complexity was significant, their behaviours could be expressed through focused public-API tests, and their responsibilities matched existing helper modules.</w:t>
+      </w:r>
+    </w:p>
+    <w:p>
+      <w:pPr/>
+      <w:r>
+        <w:t>The impact of these smells is practical rather than cosmetic. URL resolution contains many edge cases: absolute URL replacement, network-path references, empty paths, root-relative paths, current-directory relative paths, query-only and fragment-only references, dot-segment handling, and encoded path values. When these rules sit inside a public coordinating method, a future maintainer has to understand several concerns at once. Moving the details into named helpers reduces the review burden and makes future changes less likely to disturb unrelated URL behaviour.</w:t>
       </w:r>
     </w:p>
     <w:tbl>
@@ -2087,6 +2147,30 @@
       </w:r>
     </w:p>
     <w:p>
+      <w:pPr/>
+      <w:r>
+        <w:t>The existing tests were strong enough to give broad confidence in the library, but they were not sufficient as the only regression strategy for this project. The baseline suite showed that the cloned snapshot could run, but the coursework changes touched specific path-resolution behaviours. The group therefore added tests/test_url_join_regression.py and tests/test_url_joinpath_regression.py to cover the behaviours most likely to be affected. This directly answers the brief's question about whether existing test cases were enough: they were a useful base, but targeted reengineering required additional focused tests.</w:t>
+      </w:r>
+    </w:p>
+    <w:p>
+      <w:pPr/>
+      <w:r>
+        <w:t>Using multiple advanced techniques made the understanding more reliable. Repository mining explained how the system had evolved and what maintainers had previously restructured. Static analysis identified the current hotspots and code smells. Manual architecture inspection explained why those hotspots mattered. Dynamic analysis later confirmed that the new helper paths were actually exercised at runtime. Regression testing then protected behaviour. The target was therefore selected through connected evidence rather than by relying on one metric in isolation.</w:t>
+      </w:r>
+    </w:p>
+    <w:p>
+      <w:pPr/>
+      <w:r>
+        <w:t>The significance of the remaining smells was therefore judged by their likely maintenance impact. A complex method in a rarely used internal script would be less important than a complex method in the central URL class. URL.join() and URL._make_child() matter because they sit behind everyday URL path operations and because mistakes in URL resolution can be subtle: a method may return a syntactically valid URL while still preserving the wrong query, fragment, encoded segment, or base path. This is why the analysis connected code smells to behavioural risk before choosing the final restructuring target.</w:t>
+      </w:r>
+    </w:p>
+    <w:p>
+      <w:pPr/>
+      <w:r>
+        <w:t>This is also why the group kept the selected scope close to path-resolution responsibility. The analysis did not justify removing functionality or changing URL semantics; it justified making existing behaviour easier to understand, test, and maintain.</w:t>
+      </w:r>
+    </w:p>
+    <w:p>
       <w:pPr>
         <w:pStyle w:val="Heading1"/>
       </w:pPr>
@@ -2112,6 +2196,24 @@
           <w:color w:val="1F4E79"/>
         </w:rPr>
         <w:t>Restructuring Requirements</w:t>
+      </w:r>
+    </w:p>
+    <w:p>
+      <w:pPr/>
+      <w:r>
+        <w:t>The desired outcome was improved maintainability and modularity, not new functionality. The public API had to remain stable: URL, URL.join(), URL.joinpath(), and the / operator should still be called in the same way and return the same results for the protected cases. The internal goal was to make path-resolution responsibilities easier to locate by moving join-specific logic into yarl/_join.py and child path assembly into yarl/_path.py. This directly addressed the overloaded role of yarl/_url.py identified during system understanding.</w:t>
+      </w:r>
+    </w:p>
+    <w:p>
+      <w:pPr/>
+      <w:r>
+        <w:t>There were also compromises between quality attributes. A deeper rewrite might have produced a more radical design, but it would also increase compatibility risk and require broader testing. A performance-oriented change might have introduced caching or lower-level optimisations, but the project evidence did not show performance as the main problem. The achievable requirement within the timeframe was therefore a conservative structural improvement: reduce complexity in the central URL methods, preserve behaviour, and keep moved helpers private so the public maintenance contract did not grow.</w:t>
+      </w:r>
+    </w:p>
+    <w:p>
+      <w:pPr/>
+      <w:r>
+        <w:t>The implementation strategy followed the brief's expectation for both system-level restructuring and unit-level refactoring. At the unit level, complex methods were simplified by extracting named helper decisions. At the system level, those helper decisions were placed into modules with clearer responsibility boundaries. Work was split into small commits so tests and evidence could be checked after each step. This also kept the reengineering feasible for a group project rather than turning it into a complete redesign of yarl.</w:t>
       </w:r>
     </w:p>
     <w:tbl>
@@ -2675,6 +2777,18 @@
       </w:r>
     </w:p>
     <w:p>
+      <w:pPr/>
+      <w:r>
+        <w:t>The second focused test file, tests/test_url_joinpath_regression.py, protected the child-path restructuring. It covered multi-segment child path assembly, query and fragment cleanup, dot-segment handling for absolute URLs, current relative-URL behaviour, encoded path segment preservation, and the / operator. These were chosen because they are public behaviours that reach URL._make_child() even though the method itself is private.</w:t>
+      </w:r>
+    </w:p>
+    <w:p>
+      <w:pPr/>
+      <w:r>
+        <w:t>This test design was deliberately behaviour-first. The group did not write tests that assert private helper names or internal call order, because that would make the tests brittle and reduce future maintainability. Instead, the tests describe what users should observe before and after the restructuring. The final full test suite then provided a broader safety net, while the focused tests explained exactly why the selected reengineering area was protected.</w:t>
+      </w:r>
+    </w:p>
+    <w:p>
       <w:pPr>
         <w:spacing w:after="120" w:line="259" w:lineRule="auto"/>
       </w:pPr>
@@ -2728,6 +2842,18 @@
       </w:r>
     </w:p>
     <w:p>
+      <w:pPr/>
+      <w:r>
+        <w:t>This change answered the maintainability requirement by separating decisions that had previously been interleaved in one public method. URL.join() still owns the public operation and final URL construction, but _resolve_join_path(), _resolve_join_query(), and _resolve_join_fragment() describe the internal decisions separately. That makes the code easier to review because a maintainer can inspect path, query, or fragment behaviour without reading the whole join method as one block.</w:t>
+      </w:r>
+    </w:p>
+    <w:p>
+      <w:pPr/>
+      <w:r>
+        <w:t>The helper module remains private, which avoids a conflict between extensibility and compatibility. It improves internal extensibility for maintainers by creating a focused place for join behaviour, but it does not expose a new supported API that users could depend on. This is important for a library such as yarl, where adding public surface area can create future maintenance cost.</w:t>
+      </w:r>
+    </w:p>
+    <w:p>
       <w:pPr>
         <w:pStyle w:val="Heading2"/>
       </w:pPr>
@@ -2765,6 +2891,18 @@
           <w:i w:val="0"/>
         </w:rPr>
         <w:t>This extended the same restructuring narrative as the URL.join() work. yarl/_url.py remains the public facade and coordinator, while path-resolution details are progressively delegated to path-focused private modules. The public API did not change: users still call URL.joinpath() or use the / operator in the same way.</w:t>
+      </w:r>
+    </w:p>
+    <w:p>
+      <w:pPr/>
+      <w:r>
+        <w:t>The _make_child() change addressed a module-level overload. Before the change, yarl/_url.py did not only coordinate URL object state; it also assembled child path segments for joinpath() and the / operator. After the change, URL._make_child() delegates path calculation to _make_child_path() in yarl/_path.py and then uses the existing URL construction pathway. This keeps _url.py focused on object coordination and moves path-specific rules into the path module.</w:t>
+      </w:r>
+    </w:p>
+    <w:p>
+      <w:pPr/>
+      <w:r>
+        <w:t>The complexity outcome shows the effect of this decision. URL._make_child() moved from C (17) to A (1), while _make_child_path() remained B (8) and its smaller helpers stayed A-rated. This is not just a numerical improvement. It means the unavoidable path-assembly branches are now grouped with path helpers, while the public URL class method reads as a short coordination step. That is the quality improvement the restructuring requirement asked for.</w:t>
       </w:r>
     </w:p>
     <w:p>
@@ -3252,6 +3390,12 @@
           <w:i w:val="0"/>
         </w:rPr>
         <w:t>The dynamic evidence supports the core argument rather than replacing static analysis. Static analysis identified where complexity was concentrated; dynamic analysis showed that the new helper modules are part of real execution paths in the final repository.</w:t>
+      </w:r>
+    </w:p>
+    <w:p>
+      <w:pPr/>
+      <w:r>
+        <w:t>The dynamic evidence also helped compare behaviour before and after in a way that static metrics cannot. The final trace scenarios exercised URL.join(), URL.joinpath(), URL.build(), and URL.update_query(). The joinpath trace recorded calls into yarl._path:_make_child_path and _extend_with_child_segments, while the join scenario still exercised the URL construction and quoting pathway. This confirmed that the moved helper code was part of representative runtime behaviour in the final repository.</w:t>
       </w:r>
     </w:p>
     <w:p>
@@ -4099,6 +4243,108 @@
       </w:r>
     </w:p>
     <w:p>
+      <w:pPr/>
+      <w:r>
+        <w:t>The main comparison method was regression testing. Focused tests checked the behaviours most directly connected to the changed code, existing URL join/joinpath/div tests checked nearby behaviour, and the full local suite checked the wider library. The final recorded result was 1129 passed, 103 skipped, and 2 xfailed, with 7 focused URL.join tests, 7 focused URL.joinpath tests, and 143 existing URL join/joinpath/div tests passing. This provides stronger evidence than only saying that the code still imports.</w:t>
+      </w:r>
+    </w:p>
+    <w:p>
+      <w:pPr/>
+      <w:r>
+        <w:t>The structural comparison used Radon and the local evidence script. URL.join() improved from C (17) to B (8), URL._make_child() improved from C (17) to A (1), and the new helpers stayed within acceptable A/B complexity ranges. This directly demonstrates the impact of the changes on maintainability. The GitHub Actions billing limitation prevented a successful remote runner allocation, but tools/run_local_checks.py made the same final checks repeatable and saved their outputs under Submission/final-check.</w:t>
+      </w:r>
+    </w:p>
+    <w:p>
+      <w:pPr>
+        <w:jc w:val="center"/>
+      </w:pPr>
+      <w:r>
+        <w:drawing>
+          <wp:inline xmlns:a="http://schemas.openxmlformats.org/drawingml/2006/main" xmlns:pic="http://schemas.openxmlformats.org/drawingml/2006/picture">
+            <wp:extent cx="5303520" cy="2775098"/>
+            <wp:docPr id="3" name="Picture 3"/>
+            <wp:cNvGraphicFramePr>
+              <a:graphicFrameLocks noChangeAspect="1"/>
+            </wp:cNvGraphicFramePr>
+            <a:graphic>
+              <a:graphicData uri="http://schemas.openxmlformats.org/drawingml/2006/picture">
+                <pic:pic>
+                  <pic:nvPicPr>
+                    <pic:cNvPr id="0" name="complexity_before_after.png"/>
+                    <pic:cNvPicPr/>
+                  </pic:nvPicPr>
+                  <pic:blipFill>
+                    <a:blip r:embed="rId17"/>
+                    <a:stretch>
+                      <a:fillRect/>
+                    </a:stretch>
+                  </pic:blipFill>
+                  <pic:spPr>
+                    <a:xfrm>
+                      <a:off x="0" y="0"/>
+                      <a:ext cx="5303520" cy="2775098"/>
+                    </a:xfrm>
+                    <a:prstGeom prst="rect"/>
+                  </pic:spPr>
+                </pic:pic>
+              </a:graphicData>
+            </a:graphic>
+          </wp:inline>
+        </w:drawing>
+      </w:r>
+    </w:p>
+    <w:p>
+      <w:pPr/>
+      <w:r>
+        <w:t>Figure 3. Radon complexity for the two target methods before and after reengineering.</w:t>
+      </w:r>
+    </w:p>
+    <w:p>
+      <w:pPr>
+        <w:jc w:val="center"/>
+      </w:pPr>
+      <w:r>
+        <w:drawing>
+          <wp:inline xmlns:a="http://schemas.openxmlformats.org/drawingml/2006/main" xmlns:pic="http://schemas.openxmlformats.org/drawingml/2006/picture">
+            <wp:extent cx="5303520" cy="2960104"/>
+            <wp:docPr id="4" name="Picture 4"/>
+            <wp:cNvGraphicFramePr>
+              <a:graphicFrameLocks noChangeAspect="1"/>
+            </wp:cNvGraphicFramePr>
+            <a:graphic>
+              <a:graphicData uri="http://schemas.openxmlformats.org/drawingml/2006/picture">
+                <pic:pic>
+                  <pic:nvPicPr>
+                    <pic:cNvPr id="0" name="regression_evidence.png"/>
+                    <pic:cNvPicPr/>
+                  </pic:nvPicPr>
+                  <pic:blipFill>
+                    <a:blip r:embed="rId18"/>
+                    <a:stretch>
+                      <a:fillRect/>
+                    </a:stretch>
+                  </pic:blipFill>
+                  <pic:spPr>
+                    <a:xfrm>
+                      <a:off x="0" y="0"/>
+                      <a:ext cx="5303520" cy="2960104"/>
+                    </a:xfrm>
+                    <a:prstGeom prst="rect"/>
+                  </pic:spPr>
+                </pic:pic>
+              </a:graphicData>
+            </a:graphic>
+          </wp:inline>
+        </w:drawing>
+      </w:r>
+    </w:p>
+    <w:p>
+      <w:pPr/>
+      <w:r>
+        <w:t>Figure 4. Regression evidence used to check behaviour preservation after restructuring.</w:t>
+      </w:r>
+    </w:p>
+    <w:p>
       <w:pPr>
         <w:pStyle w:val="Heading2"/>
       </w:pPr>
@@ -4139,6 +4385,12 @@
       </w:r>
     </w:p>
     <w:p>
+      <w:pPr/>
+      <w:r>
+        <w:t>The main limitation is that the work does not claim a performance improvement. The dynamic analysis was used to understand runtime responsibility flow, not to benchmark speed. Another limitation is that the focused tests are representative rather than exhaustive. A production maintainer considering a larger URL-resolution rewrite would likely add broader specification-based or property-based tests. For this project, the selected scope was appropriate because it achieved the maintainability requirement without expanding the public API or adding unrequested functionality.</w:t>
+      </w:r>
+    </w:p>
+    <w:p>
       <w:pPr>
         <w:pStyle w:val="Heading1"/>
       </w:pPr>
@@ -4256,6 +4508,44 @@
           <w:i w:val="0"/>
         </w:rPr>
         <w:t>With more time, the group would inspect URL.build() more deeply, add broader dynamic scenarios, and consider performance benchmarks for URL construction and joining. The group would also prefer a fully working remote CI run, but the account-level GitHub Actions limitation meant that local verification had to be recorded as the main evidence.</w:t>
+      </w:r>
+    </w:p>
+    <w:p>
+      <w:pPr>
+        <w:pStyle w:val="Heading2"/>
+      </w:pPr>
+      <w:r>
+        <w:t>Member Reflections</w:t>
+      </w:r>
+    </w:p>
+    <w:p>
+      <w:pPr/>
+      <w:r>
+        <w:t>Dibing Bai: The most challenging part of the setup and baseline work was making the project evidence repeatable on a local machine. This was addressed by recording baseline outputs, keeping environment assumptions explicit, and using focused tests before relying on broader verification.</w:t>
+      </w:r>
+    </w:p>
+    <w:p>
+      <w:pPr/>
+      <w:r>
+        <w:t>Yongjiang Liu: The most challenging part of coordination was turning separate analysis, testing, refactoring, GitHub, and report activities into one coherent reengineering argument. This was addressed by repeatedly checking the brief, keeping the target narrow, coordinating the branch and PR work, and linking report claims to committed evidence.</w:t>
+      </w:r>
+    </w:p>
+    <w:p>
+      <w:pPr/>
+      <w:r>
+        <w:t>Jingxuan Wang: The most challenging part of static analysis was interpreting metrics without treating them as automatic decisions. This was addressed by combining Radon results with architecture review, code-smell reasoning, test adequacy, and risk assessment before choosing the final restructuring targets.</w:t>
+      </w:r>
+    </w:p>
+    <w:p>
+      <w:pPr/>
+      <w:r>
+        <w:t>Ziqi Zhao: The most challenging part of regression testing was covering behaviour that users observe while the implementation details changed underneath. This was addressed by writing focused public-API tests for URL.join(), URL.joinpath(), and the / operator before accepting the helper extraction and path restructuring.</w:t>
+      </w:r>
+    </w:p>
+    <w:p>
+      <w:pPr/>
+      <w:r>
+        <w:t>Xuhao Zhou: The most challenging part of evidence preparation was showing that the final result had been checked despite the GitHub Actions account limitation. This was addressed by restoring a minimal workflow, recording the remote failure reason, adding dynamic analysis evidence, and saving repeatable local verification outputs.</w:t>
       </w:r>
     </w:p>
     <w:p>

</xml_diff>

<commit_message>
Add final report PDF and LaTeX export
</commit_message>
<xml_diff>
--- a/Report/COM6523 Software Reengineering Group Project Report.docx
+++ b/Report/COM6523 Software Reengineering Group Project Report.docx
@@ -2,6 +2,45 @@
 <file path=word/document.xml><?xml version="1.0" encoding="utf-8"?>
 <w:document xmlns:wpc="http://schemas.microsoft.com/office/word/2010/wordprocessingCanvas" xmlns:cx="http://schemas.microsoft.com/office/drawing/2014/chartex" xmlns:cx1="http://schemas.microsoft.com/office/drawing/2015/9/8/chartex" xmlns:cx2="http://schemas.microsoft.com/office/drawing/2015/10/21/chartex" xmlns:cx3="http://schemas.microsoft.com/office/drawing/2016/5/9/chartex" xmlns:cx4="http://schemas.microsoft.com/office/drawing/2016/5/10/chartex" xmlns:cx5="http://schemas.microsoft.com/office/drawing/2016/5/11/chartex" xmlns:cx6="http://schemas.microsoft.com/office/drawing/2016/5/12/chartex" xmlns:cx7="http://schemas.microsoft.com/office/drawing/2016/5/13/chartex" xmlns:cx8="http://schemas.microsoft.com/office/drawing/2016/5/14/chartex" xmlns:mc="http://schemas.openxmlformats.org/markup-compatibility/2006" xmlns:aink="http://schemas.microsoft.com/office/drawing/2016/ink" xmlns:am3d="http://schemas.microsoft.com/office/drawing/2017/model3d" xmlns:o="urn:schemas-microsoft-com:office:office" xmlns:oel="http://schemas.microsoft.com/office/2019/extlst" xmlns:r="http://schemas.openxmlformats.org/officeDocument/2006/relationships" xmlns:m="http://schemas.openxmlformats.org/officeDocument/2006/math" xmlns:v="urn:schemas-microsoft-com:vml" xmlns:wp14="http://schemas.microsoft.com/office/word/2010/wordprocessingDrawing" xmlns:wp="http://schemas.openxmlformats.org/drawingml/2006/wordprocessingDrawing" xmlns:w10="urn:schemas-microsoft-com:office:word" xmlns:w="http://schemas.openxmlformats.org/wordprocessingml/2006/main" xmlns:w14="http://schemas.microsoft.com/office/word/2010/wordml" xmlns:w15="http://schemas.microsoft.com/office/word/2012/wordml" xmlns:w16cex="http://schemas.microsoft.com/office/word/2018/wordml/cex" xmlns:w16cid="http://schemas.microsoft.com/office/word/2016/wordml/cid" xmlns:w16="http://schemas.microsoft.com/office/word/2018/wordml" xmlns:w16du="http://schemas.microsoft.com/office/word/2023/wordml/word16du" xmlns:w16sdtdh="http://schemas.microsoft.com/office/word/2020/wordml/sdtdatahash" xmlns:w16sdtfl="http://schemas.microsoft.com/office/word/2024/wordml/sdtformatlock" xmlns:w16se="http://schemas.microsoft.com/office/word/2015/wordml/symex" xmlns:wpg="http://schemas.microsoft.com/office/word/2010/wordprocessingGroup" xmlns:wpi="http://schemas.microsoft.com/office/word/2010/wordprocessingInk" xmlns:wne="http://schemas.microsoft.com/office/word/2006/wordml" xmlns:wps="http://schemas.microsoft.com/office/word/2010/wordprocessingShape" mc:Ignorable="w14 w15 w16se w16cid w16 w16cex w16sdtdh w16sdtfl w16du wp14">
   <w:body>
+    <w:p>
+      <w:pPr>
+        <w:jc w:val="center"/>
+      </w:pPr>
+      <w:r>
+        <w:drawing>
+          <wp:inline xmlns:a="http://schemas.openxmlformats.org/drawingml/2006/main" xmlns:pic="http://schemas.openxmlformats.org/drawingml/2006/picture">
+            <wp:extent cx="1965960" cy="1106180"/>
+            <wp:docPr id="5" name="Picture 5"/>
+            <wp:cNvGraphicFramePr>
+              <a:graphicFrameLocks noChangeAspect="1"/>
+            </wp:cNvGraphicFramePr>
+            <a:graphic>
+              <a:graphicData uri="http://schemas.openxmlformats.org/drawingml/2006/picture">
+                <pic:pic>
+                  <pic:nvPicPr>
+                    <pic:cNvPr id="0" name="university_of_sheffield_logo.jpg"/>
+                    <pic:cNvPicPr/>
+                  </pic:nvPicPr>
+                  <pic:blipFill>
+                    <a:blip r:embed="rId19"/>
+                    <a:stretch>
+                      <a:fillRect/>
+                    </a:stretch>
+                  </pic:blipFill>
+                  <pic:spPr>
+                    <a:xfrm>
+                      <a:off x="0" y="0"/>
+                      <a:ext cx="1965960" cy="1106180"/>
+                    </a:xfrm>
+                    <a:prstGeom prst="rect"/>
+                  </pic:spPr>
+                </pic:pic>
+              </a:graphicData>
+            </a:graphic>
+          </wp:inline>
+        </w:drawing>
+      </w:r>
+    </w:p>
     <w:p>
       <w:pPr>
         <w:spacing w:after="240"/>
@@ -4813,6 +4852,18 @@
           </w:p>
         </w:tc>
       </w:tr>
+      <w:tr>
+        <w:tc>
+          <w:tcPr>
+            <w:tcW w:type="dxa" w:w="9458"/>
+          </w:tcPr>
+          <w:p>
+            <w:r>
+              <w:t>University of Sheffield brand toolkit: https://www.sheffield.ac.uk/brand-toolkit/introducing-our-brand-identity</w:t>
+            </w:r>
+          </w:p>
+        </w:tc>
+      </w:tr>
     </w:tbl>
     <w:p/>
     <w:p>
@@ -10785,12 +10836,7 @@
         <w:spacing w:after="120" w:line="259" w:lineRule="auto"/>
       </w:pPr>
       <w:r>
-        <w:rPr>
-          <w:rFonts w:ascii="Arial" w:hAnsi="Arial" w:eastAsia="Arial"/>
-          <w:b w:val="0"/>
-          <w:i w:val="0"/>
-        </w:rPr>
-        <w:t>Additional direct commits completed the final evidence chain after the earlier pull requests: 64cee18 Add URL.joinpath regression tests; eb405b9 Move child path assembly into path helpers; 26270ef Make analysis scripts reproducible; 309e713 Add dynamic analysis evidence for URL path operations; f5907a7 Restore minimal regression workflow triggers; 822f061 Refresh final verification evidence; c6f57ff Record GitHub Actions billing limitation.</w:t>
+        <w:t>Additional direct commits completed the final evidence chain after the earlier pull requests: 64cee18 Add URL.joinpath regression tests; eb405b9 Move child path assembly into path helpers; 26270ef Make analysis scripts reproducible; 309e713 Add dynamic analysis evidence for URL path operations; f5907a7 Restore minimal regression workflow triggers; 822f061 Refresh final verification evidence; c6f57ff Record GitHub Actions billing limitation. Later documentation commits on codex/update-final-report updated the final report and deliverables: c14989e Update final report with completed reengineering evidence; 2a71a9a Clarify AI use disclosure in final report; 5fa0ff0 Update report members and AI disclosure; 0529b57 Expand final report body and evidence figures. The code reengineering commits are the implementation commits listed before these documentation-only updates.</w:t>
       </w:r>
     </w:p>
     <w:p>

</xml_diff>

<commit_message>
Polish final report cover and PDF export
</commit_message>
<xml_diff>
--- a/Report/COM6523 Software Reengineering Group Project Report.docx
+++ b/Report/COM6523 Software Reengineering Group Project Report.docx
@@ -9,7 +9,7 @@
       <w:r>
         <w:drawing>
           <wp:inline xmlns:a="http://schemas.openxmlformats.org/drawingml/2006/main" xmlns:pic="http://schemas.openxmlformats.org/drawingml/2006/picture">
-            <wp:extent cx="1965960" cy="1106180"/>
+            <wp:extent cx="1691640" cy="748513"/>
             <wp:docPr id="5" name="Picture 5"/>
             <wp:cNvGraphicFramePr>
               <a:graphicFrameLocks noChangeAspect="1"/>
@@ -18,11 +18,11 @@
               <a:graphicData uri="http://schemas.openxmlformats.org/drawingml/2006/picture">
                 <pic:pic>
                   <pic:nvPicPr>
-                    <pic:cNvPr id="0" name="university_of_sheffield_logo.jpg"/>
+                    <pic:cNvPr id="0" name="image.png"/>
                     <pic:cNvPicPr/>
                   </pic:nvPicPr>
                   <pic:blipFill>
-                    <a:blip r:embed="rId19"/>
+                    <a:blip r:embed="rId20"/>
                     <a:stretch>
                       <a:fillRect/>
                     </a:stretch>
@@ -30,7 +30,7 @@
                   <pic:spPr>
                     <a:xfrm>
                       <a:off x="0" y="0"/>
-                      <a:ext cx="1965960" cy="1106180"/>
+                      <a:ext cx="1691640" cy="748513"/>
                     </a:xfrm>
                     <a:prstGeom prst="rect"/>
                   </pic:spPr>

</xml_diff>